<commit_message>
job-search: humanize Seeq resume + cold re-score (90/100)
Reworked the "AI With Judgment" achievement to drop a tailing
negation and a label restatement; regenerated the ATS docx. Cold
recruiter re-audit (pass 2) lands at 90, down from 91 without
anchoring; still a clear pass.

Co-Authored-By: Claude Opus 4.6 <noreply@anthropic.com>
</commit_message>
<xml_diff>
--- a/00 Human/30 Projects/Job Search/Applications/Seeq/chris-monnat-resume(seeq).docx
+++ b/00 Human/30 Projects/Job Search/Applications/Seeq/chris-monnat-resume(seeq).docx
@@ -40,7 +40,7 @@
           <w:sz w:val="20"/>
           <w:szCs w:val="20"/>
         </w:rPr>
-        <w:t>Alexandria, VA | 585-355-6495 | chris@monn</w:t>
+        <w:t xml:space="preserve">Alexandria, VA | 585-355-6495 | </w:t>
       </w:r>
       <w:r>
         <w:rPr>
@@ -48,7 +48,7 @@
           <w:sz w:val="20"/>
           <w:szCs w:val="20"/>
         </w:rPr>
-        <w:t>a</w:t>
+        <w:t>cmmonnat@gmail.com</w:t>
       </w:r>
       <w:r>
         <w:rPr>
@@ -56,7 +56,7 @@
           <w:sz w:val="20"/>
           <w:szCs w:val="20"/>
         </w:rPr>
-        <w:t xml:space="preserve">t.org </w:t>
+        <w:t xml:space="preserve"> </w:t>
       </w:r>
       <w:r>
         <w:rPr>
@@ -81,7 +81,7 @@
           <w:sz w:val="20"/>
           <w:szCs w:val="20"/>
         </w:rPr>
-        <w:t xml:space="preserve">chrismonnat</w:t>
+        <w:t>chrismonnat</w:t>
       </w:r>
       <w:proofErr w:type="spellEnd"/>
     </w:p>
@@ -114,7 +114,7 @@
           <w:sz w:val="32"/>
           <w:szCs w:val="32"/>
         </w:rPr>
-        <w:t xml:space="preserve">VP of Engineering</w:t>
+        <w:t>VP of Engineering</w:t>
       </w:r>
     </w:p>
     <w:p>
@@ -131,39 +131,7 @@
           <w:sz w:val="21"/>
           <w:szCs w:val="21"/>
         </w:rPr>
-        <w:t xml:space="preserve">Engineering leader who came up through architecture and still ships code, running cross-functional squads as a manager of managers. At Industry Dive, grew one team of 8 into five teams of 40-plus and cut time-to-ship 35 percent with a paved-road platform. At Pipeline 360, took a revenue-critical AWS platform from zero to production in under 90 days. Known for leveling up healthy teams without breaking what already works.</w:t>
-      </w:r>
-      <w:proofErr w:type="spellStart"/>
-      <w:r>
-        <w:rPr>
-          <w:sz w:val="21"/>
-          <w:szCs w:val="21"/>
-        </w:rPr>
-        <w:t xml:space="preserve"/>
-      </w:r>
-      <w:proofErr w:type="spellEnd"/>
-      <w:r>
-        <w:rPr>
-          <w:sz w:val="21"/>
-          <w:szCs w:val="21"/>
-        </w:rPr>
-        <w:t xml:space="preserve"/>
-      </w:r>
-      <w:proofErr w:type="gramStart"/>
-      <w:r>
-        <w:rPr>
-          <w:sz w:val="21"/>
-          <w:szCs w:val="21"/>
-        </w:rPr>
-        <w:t xml:space="preserve"/>
-      </w:r>
-      <w:proofErr w:type="gramEnd"/>
-      <w:r>
-        <w:rPr>
-          <w:sz w:val="21"/>
-          <w:szCs w:val="21"/>
-        </w:rPr>
-        <w:t xml:space="preserve"/>
+        <w:t>Engineering leader who came up through architecture and still ships code, running cross-functional squads as a manager of managers. At Industry Dive, grew one team of 8 into five teams of 40-plus and cut time-to-ship 35 percent with a paved-road platform. At Pipeline 360, took a revenue-critical AWS platform from zero to production in under 90 days. Known for leveling up healthy teams without breaking what already works.</w:t>
       </w:r>
     </w:p>
     <w:p>
@@ -182,7 +150,7 @@
           <w:bCs/>
           <w:smallCaps/>
         </w:rPr>
-        <w:t xml:space="preserve">Signature Achievements</w:t>
+        <w:t>Signature Achievements</w:t>
       </w:r>
     </w:p>
     <w:p>
@@ -204,7 +172,7 @@
           <w:sz w:val="21"/>
           <w:szCs w:val="21"/>
         </w:rPr>
-        <w:t xml:space="preserve">Scaled Healthy Squads: Grew one team of 8 into five cross-functional squads of 40-plus across time zones, built the manager-of-managers layer, and lifted retention 15 percent with career ladders and clear standards.</w:t>
+        <w:t>Scaled Healthy Squads: Grew one team of 8 into five cross-functional squads of 40-plus across time zones, built the manager-of-managers layer, and lifted retention 15 percent with career ladders and clear standards.</w:t>
       </w:r>
     </w:p>
     <w:p>
@@ -226,7 +194,7 @@
           <w:sz w:val="21"/>
           <w:szCs w:val="21"/>
         </w:rPr>
-        <w:t xml:space="preserve">Platform Teams Build On: Cut average time-to-ship 35 percent with a paved-road platform of self-service provisioning, shared services, and automated testing, then spread it across 100-plus properties so squads shipped features instead of fighting infrastructure.</w:t>
+        <w:t>Platform Teams Build On: Cut average time-to-ship 35 percent with a paved-road platform of self-service provisioning, shared services, and automated testing, then spread it across 100-plus properties so squads shipped features instead of fighting infrastructure.</w:t>
       </w:r>
     </w:p>
     <w:p>
@@ -248,7 +216,7 @@
           <w:sz w:val="21"/>
           <w:szCs w:val="21"/>
         </w:rPr>
-        <w:t xml:space="preserve">Shipped Under Pressure: Delivered a revenue-critical multi-tenant platform on AWS from zero to production in under 90 days, holding reliability and security while protecting an 8-figure line.</w:t>
+        <w:t>Shipped Under Pressure: Delivered a revenue-critical multi-tenant platform on AWS from zero to production in under 90 days, holding reliability and security while protecting an 8-figure line.</w:t>
       </w:r>
     </w:p>
     <w:p>
@@ -270,7 +238,7 @@
           <w:sz w:val="21"/>
           <w:szCs w:val="21"/>
         </w:rPr>
-        <w:t xml:space="preserve">AI With Judgment: Moved agentic and LLM-backed systems from early pilots to governed production with reusable components, evaluation harnesses, and guardrails, so a lean team ships AI that shows judgment, not slop.</w:t>
+        <w:t>AI With Judgment: Moved agentic and LLM-backed systems from early pilots to governed production with reusable components, evaluation harnesses, and guardrails, so a lean team ships AI that holds up in production instead of slop.</w:t>
       </w:r>
     </w:p>
     <w:p>
@@ -290,7 +258,7 @@
           <w:bCs/>
           <w:smallCaps/>
         </w:rPr>
-        <w:t xml:space="preserve">Work Experience</w:t>
+        <w:t>Work Experience</w:t>
       </w:r>
     </w:p>
     <w:p>
@@ -310,7 +278,7 @@
           <w:bCs/>
           <w:smallCaps/>
         </w:rPr>
-        <w:t xml:space="preserve">Dual Logic, Remote | 2026</w:t>
+        <w:t>Dual Logic, Remote | 2026</w:t>
       </w:r>
     </w:p>
     <w:p>
@@ -328,7 +296,7 @@
           <w:b/>
           <w:bCs/>
         </w:rPr>
-        <w:t xml:space="preserve">Chief Technology Officer &amp; Managing Partner</w:t>
+        <w:t>Chief Technology Officer &amp; Managing Partner</w:t>
       </w:r>
     </w:p>
     <w:p>
@@ -357,7 +325,7 @@
           <w:sz w:val="21"/>
           <w:szCs w:val="21"/>
         </w:rPr>
-        <w:t xml:space="preserve">Lead the technical side of a full-service AI consulting firm, owning technical vision, architecture, and delivery from discovery through production for enterprise clients.</w:t>
+        <w:t>Lead the technical side of a full-service AI consulting firm, owning technical vision, architecture, and delivery from discovery through production for enterprise clients.</w:t>
       </w:r>
     </w:p>
     <w:p>
@@ -390,7 +358,7 @@
           <w:sz w:val="21"/>
           <w:szCs w:val="21"/>
         </w:rPr>
-        <w:t xml:space="preserve">Act as player-coach for enterprise clients, still hands-on in code while carrying agentic and RAG-backed systems from architecture through governed production with the evaluation and guardrails that keep AI trustworthy in real use.</w:t>
+        <w:t>Act as player-coach for enterprise clients, still hands-on in code while carrying agentic and RAG-backed systems from architecture through governed production with the evaluation and guardrails that keep AI trustworthy in real use.</w:t>
       </w:r>
     </w:p>
     <w:p>
@@ -423,7 +391,7 @@
           <w:sz w:val="21"/>
           <w:szCs w:val="21"/>
         </w:rPr>
-        <w:t xml:space="preserve">Brought AI into developer tooling and the SDLC, packaging reusable agent skills and DevSecOps checks so small teams ship daily with output quality, hallucination, and cost under control.</w:t>
+        <w:t>Brought AI into developer tooling and the SDLC, packaging reusable agent skills and DevSecOps checks so small teams ship daily with output quality, hallucination, and cost under control.</w:t>
       </w:r>
     </w:p>
     <w:p>
@@ -456,7 +424,7 @@
           <w:sz w:val="21"/>
           <w:szCs w:val="21"/>
         </w:rPr>
-        <w:t xml:space="preserve">Drove AI-forward development across an 800-plus engineer org, turning scattered one-off scripts into a shared, evaluated platform teams trust and use every day.</w:t>
+        <w:t>Drove AI-forward development across an 800-plus engineer org, turning scattered one-off scripts into a shared, evaluated platform teams trust and use every day.</w:t>
       </w:r>
     </w:p>
     <w:p>
@@ -489,7 +457,7 @@
           <w:sz w:val="21"/>
           <w:szCs w:val="21"/>
         </w:rPr>
-        <w:t xml:space="preserve">Turn ambiguous executive goals into roadmaps a CEO can fund, owning the build-versus-buy calls and the security-first, cloud-native architecture underneath them.</w:t>
+        <w:t>Turn ambiguous executive goals into roadmaps a CEO can fund, owning the build-versus-buy calls and the security-first, cloud-native architecture underneath them.</w:t>
       </w:r>
     </w:p>
     <w:p>
@@ -519,15 +487,17 @@
           <w:smallCaps/>
         </w:rPr>
       </w:pPr>
-      <w:r>
+    </w:p>
+    <w:p>
+      <w:pPr>
+        <w:spacing w:before="30" w:after="30" w:line="240" w:lineRule="auto"/>
         <w:rPr>
           <w:rFonts w:ascii="Calibri" w:hAnsi="Calibri" w:cs="Calibri"/>
           <w:b/>
           <w:bCs/>
           <w:smallCaps/>
         </w:rPr>
-        <w:t xml:space="preserve">Pipeline 360, Remote | 2025-2026</w:t>
-      </w:r>
+      </w:pPr>
     </w:p>
     <w:p>
       <w:pPr>
@@ -536,6 +506,7 @@
           <w:rFonts w:ascii="Calibri" w:hAnsi="Calibri" w:cs="Calibri"/>
           <w:b/>
           <w:bCs/>
+          <w:smallCaps/>
         </w:rPr>
       </w:pPr>
       <w:r>
@@ -543,8 +514,28 @@
           <w:rFonts w:ascii="Calibri" w:hAnsi="Calibri" w:cs="Calibri"/>
           <w:b/>
           <w:bCs/>
-        </w:rPr>
-        <w:t xml:space="preserve">Sr. Vice President, Technology</w:t>
+          <w:smallCaps/>
+        </w:rPr>
+        <w:lastRenderedPageBreak/>
+        <w:t>Pipeline 360, Remote | 2025-2026</w:t>
+      </w:r>
+    </w:p>
+    <w:p>
+      <w:pPr>
+        <w:spacing w:before="30" w:after="30" w:line="240" w:lineRule="auto"/>
+        <w:rPr>
+          <w:rFonts w:ascii="Calibri" w:hAnsi="Calibri" w:cs="Calibri"/>
+          <w:b/>
+          <w:bCs/>
+        </w:rPr>
+      </w:pPr>
+      <w:r>
+        <w:rPr>
+          <w:rFonts w:ascii="Calibri" w:hAnsi="Calibri" w:cs="Calibri"/>
+          <w:b/>
+          <w:bCs/>
+        </w:rPr>
+        <w:t>Sr. Vice President, Technology</w:t>
       </w:r>
     </w:p>
     <w:p>
@@ -573,7 +564,7 @@
           <w:sz w:val="21"/>
           <w:szCs w:val="21"/>
         </w:rPr>
-        <w:t xml:space="preserve">Owned technology strategy, platform architecture, and delivery across product, engineering, data, IT, security, and compliance for a newly independent, PE-backed, 100% remote org of 100+.</w:t>
+        <w:t>Owned technology strategy, platform architecture, and delivery across product, engineering, data, IT, security, and compliance for a newly independent, PE-backed, 100% remote org of 100+.</w:t>
       </w:r>
     </w:p>
     <w:p>
@@ -606,7 +597,7 @@
           <w:sz w:val="21"/>
           <w:szCs w:val="21"/>
         </w:rPr>
-        <w:t xml:space="preserve">Delivered a revenue-critical, multi-tenant platform from zero to production in under 90 days on AWS (EKS, Lambda, S3), protecting an 8-figure revenue line through a post-divestiture reset.</w:t>
+        <w:t>Delivered a revenue-critical, multi-tenant platform from zero to production in under 90 days on AWS (EKS, Lambda, S3), protecting an 8-figure revenue line through a post-divestiture reset.</w:t>
       </w:r>
     </w:p>
     <w:p>
@@ -639,7 +630,7 @@
           <w:sz w:val="21"/>
           <w:szCs w:val="21"/>
         </w:rPr>
-        <w:t xml:space="preserve">Owned architecture for distributed, high-volume, low-latency systems on AWS, Kubernetes, and PostgreSQL, tuning for performance and cost under production load across regions.</w:t>
+        <w:t>Owned architecture for distributed, high-volume, low-latency systems on AWS, Kubernetes, and PostgreSQL, tuning for performance and cost under production load across regions.</w:t>
       </w:r>
     </w:p>
     <w:p>
@@ -672,7 +663,7 @@
           <w:sz w:val="21"/>
           <w:szCs w:val="21"/>
         </w:rPr>
-        <w:t xml:space="preserve">Matured CI/CD and Infrastructure-as-Code into self-service provisioning and deploys, replacing ticket queues and improving developer experience and lead time.</w:t>
+        <w:t>Matured CI/CD and Infrastructure-as-Code into self-service provisioning and deploys, replacing ticket queues and improving developer experience and lead time.</w:t>
       </w:r>
     </w:p>
     <w:p>
@@ -705,7 +696,7 @@
           <w:sz w:val="21"/>
           <w:szCs w:val="21"/>
         </w:rPr>
-        <w:t xml:space="preserve">Ran the operating cadence and delivery metrics that kept multiple product lines shipping predictably, partnering with Product to turn roadmap into released software.</w:t>
+        <w:t>Ran the operating cadence and delivery metrics that kept multiple product lines shipping predictably, partnering with Product to turn roadmap into released software.</w:t>
       </w:r>
     </w:p>
     <w:p>
@@ -742,7 +733,7 @@
           <w:bCs/>
           <w:smallCaps/>
         </w:rPr>
-        <w:t xml:space="preserve">Industry Dive / Informa TechTarget, Washington, DC | 2018-2025</w:t>
+        <w:t>Industry Dive / Informa TechTarget, Washington, DC | 2018-2025</w:t>
       </w:r>
     </w:p>
     <w:p>
@@ -760,7 +751,7 @@
           <w:b/>
           <w:bCs/>
         </w:rPr>
-        <w:t xml:space="preserve">VP, Engineering</w:t>
+        <w:t>VP, Engineering</w:t>
       </w:r>
     </w:p>
     <w:p>
@@ -789,7 +780,7 @@
           <w:sz w:val="21"/>
           <w:szCs w:val="21"/>
         </w:rPr>
-        <w:t xml:space="preserve">Founded and scaled the platform and product-engineering organization for a consumer-facing digital-media SaaS through post-acquisition integration.</w:t>
+        <w:t>Founded and scaled the platform and product-engineering organization for a consumer-facing digital-media SaaS through post-acquisition integration.</w:t>
       </w:r>
     </w:p>
     <w:p>
@@ -822,7 +813,7 @@
           <w:sz w:val="21"/>
           <w:szCs w:val="21"/>
         </w:rPr>
-        <w:t xml:space="preserve">Founded and scaled the platform and delivery organization behind 100-plus customer-facing properties serving millions, maturing SRE, observability, and automated CI/CD on AWS and Kubernetes to hold high availability through constant change.</w:t>
+        <w:t>Founded and scaled the platform and delivery organization behind 100-plus customer-facing properties serving millions, maturing SRE, observability, and automated CI/CD on AWS and Kubernetes to hold high availability through constant change.</w:t>
       </w:r>
     </w:p>
     <w:p>
@@ -855,7 +846,7 @@
           <w:sz w:val="21"/>
           <w:szCs w:val="21"/>
         </w:rPr>
-        <w:t xml:space="preserve">Grew one team of 8 into five cross-functional squads of 40-plus across time zones, built the manager-of-managers leadership layer, and lifted retention 15 percent with career ladders and structured feedback.</w:t>
+        <w:t>Grew one team of 8 into five cross-functional squads of 40-plus across time zones, built the manager-of-managers leadership layer, and lifted retention 15 percent with career ladders and structured feedback.</w:t>
       </w:r>
     </w:p>
     <w:p>
@@ -888,7 +879,7 @@
           <w:sz w:val="21"/>
           <w:szCs w:val="21"/>
         </w:rPr>
-        <w:t xml:space="preserve">Built a paved-road delivery model where self-service provisioning and automated testing cut average time-to-ship 35 percent, then made it the default so squads shipped features instead of fighting infrastructure.</w:t>
+        <w:t>Built a paved-road delivery model where self-service provisioning and automated testing cut average time-to-ship 35 percent, then made it the default so squads shipped features instead of fighting infrastructure.</w:t>
       </w:r>
     </w:p>
     <w:p>
@@ -921,7 +912,7 @@
           <w:sz w:val="21"/>
           <w:szCs w:val="21"/>
         </w:rPr>
-        <w:t xml:space="preserve">Built the Product Management function from zero and shipped AI-driven personalization and lead-qualification into the core product, pairing predictive scoring with a human review loop.</w:t>
+        <w:t>Built the Product Management function from zero and shipped AI-driven personalization and lead-qualification into the core product, pairing predictive scoring with a human review loop.</w:t>
       </w:r>
     </w:p>
     <w:p>
@@ -958,7 +949,7 @@
           <w:bCs/>
           <w:smallCaps/>
         </w:rPr>
-        <w:t xml:space="preserve">Phone2Action, Arlington, VA | 2016-2017</w:t>
+        <w:t>Phone2Action, Arlington, VA | 2016-2017</w:t>
       </w:r>
     </w:p>
     <w:p>
@@ -976,7 +967,7 @@
           <w:b/>
           <w:bCs/>
         </w:rPr>
-        <w:t xml:space="preserve">VP, Engineering</w:t>
+        <w:t>VP, Engineering</w:t>
       </w:r>
     </w:p>
     <w:p>
@@ -1005,7 +996,7 @@
           <w:sz w:val="21"/>
           <w:szCs w:val="21"/>
         </w:rPr>
-        <w:t xml:space="preserve">Led engineering through Series-A growth for a fast-scaling consumer SaaS, bringing planning, delivery, and reliability structure to an early-stage team.</w:t>
+        <w:t>Led engineering through Series-A growth for a fast-scaling consumer SaaS, bringing planning, delivery, and reliability structure to an early-stage team.</w:t>
       </w:r>
     </w:p>
     <w:p>
@@ -1038,7 +1029,7 @@
           <w:sz w:val="21"/>
           <w:szCs w:val="21"/>
         </w:rPr>
-        <w:t xml:space="preserve">Brought planning, estimation, and on-call structure to a Series-A team, reaching steady sprint predictability inside 60 days without losing momentum.</w:t>
+        <w:t>Brought planning, estimation, and on-call structure to a Series-A team, reaching steady sprint predictability inside 60 days without losing momentum.</w:t>
       </w:r>
     </w:p>
     <w:p>
@@ -1071,7 +1062,7 @@
           <w:sz w:val="21"/>
           <w:szCs w:val="21"/>
         </w:rPr>
-        <w:t xml:space="preserve">Doubled the team with no drop in release quality by adding sprint cadence, code-review gates, and a clear on-call rotation across web, iOS, and Android.</w:t>
+        <w:t>Doubled the team with no drop in release quality by adding sprint cadence, code-review gates, and a clear on-call rotation across web, iOS, and Android.</w:t>
       </w:r>
     </w:p>
     <w:p>
@@ -1150,8 +1141,34 @@
           <w:sz w:val="21"/>
           <w:szCs w:val="21"/>
         </w:rPr>
+        <w:t>Member, Entrepreneurship Institute</w:t>
+      </w:r>
+    </w:p>
+    <w:p>
+      <w:pPr>
+        <w:spacing w:after="0"/>
+        <w:rPr>
+          <w:bCs/>
+          <w:sz w:val="21"/>
+          <w:szCs w:val="21"/>
+        </w:rPr>
+      </w:pPr>
+      <w:r>
+        <w:rPr>
+          <w:b/>
+          <w:sz w:val="21"/>
+          <w:szCs w:val="21"/>
+        </w:rPr>
         <w:lastRenderedPageBreak/>
-        <w:t>Member, Entrepreneurship Institute</w:t>
+        <w:t>Certified AI Engineer</w:t>
+      </w:r>
+      <w:r>
+        <w:rPr>
+          <w:bCs/>
+          <w:sz w:val="21"/>
+          <w:szCs w:val="21"/>
+        </w:rPr>
+        <w:t xml:space="preserve"> | AI Makerspace</w:t>
       </w:r>
     </w:p>
     <w:p>
@@ -1284,20 +1301,17 @@
           <w:bCs/>
           <w:smallCaps/>
         </w:rPr>
-        <w:t xml:space="preserve">Skills</w:t>
-      </w:r>
-    </w:p>
-    <w:p>
-      <w:pPr>
-        <w:rPr>
-          <w:b/>
-          <w:sz w:val="21"/>
-          <w:szCs w:val="21"/>
-        </w:rPr>
-      </w:pPr>
-      <w:r>
-        <w:t xml:space="preserve"/>
-      </w:r>
+        <w:t>Skills</w:t>
+      </w:r>
+    </w:p>
+    <w:p>
+      <w:pPr>
+        <w:rPr>
+          <w:b/>
+          <w:sz w:val="21"/>
+          <w:szCs w:val="21"/>
+        </w:rPr>
+      </w:pPr>
       <w:r>
         <w:rPr>
           <w:b/>
@@ -1312,149 +1326,71 @@
           <w:sz w:val="21"/>
           <w:szCs w:val="21"/>
         </w:rPr>
-        <w:t xml:space="preserve">Distributed systems, AWS, GCP, multi-cloud, Kubernetes, PostgreSQL</w:t>
-      </w:r>
-      <w:r>
-        <w:t xml:space="preserve"/>
-      </w:r>
-      <w:r>
-        <w:rPr>
-          <w:b/>
-          <w:bCs/>
-          <w:sz w:val="21"/>
-          <w:szCs w:val="21"/>
-        </w:rPr>
-        <w:t xml:space="preserve">  •  </w:t>
-      </w:r>
-      <w:r>
-        <w:t xml:space="preserve"/>
-      </w:r>
-      <w:r>
-        <w:t xml:space="preserve"/>
-      </w:r>
-      <w:r>
-        <w:rPr>
-          <w:b/>
-          <w:bCs/>
-          <w:sz w:val="21"/>
-          <w:szCs w:val="21"/>
-        </w:rPr>
-        <w:t xml:space="preserve">Delivery &amp; DevOps: </w:t>
-      </w:r>
-      <w:r>
-        <w:rPr>
-          <w:sz w:val="21"/>
-          <w:szCs w:val="21"/>
-        </w:rPr>
-        <w:t xml:space="preserve">Agile/Scrumban, CI/CD, DevOps, secure SDLC, SRE, observability</w:t>
-      </w:r>
-      <w:r>
-        <w:t xml:space="preserve"/>
-      </w:r>
-      <w:r>
-        <w:rPr>
-          <w:b/>
-          <w:bCs/>
-          <w:sz w:val="21"/>
-          <w:szCs w:val="21"/>
-        </w:rPr>
-        <w:t xml:space="preserve">  •  </w:t>
-      </w:r>
-      <w:r>
-        <w:t xml:space="preserve"/>
-      </w:r>
-      <w:r>
-        <w:t xml:space="preserve"/>
-      </w:r>
-      <w:r>
-        <w:rPr>
-          <w:b/>
-          <w:bCs/>
-          <w:sz w:val="21"/>
-          <w:szCs w:val="21"/>
-        </w:rPr>
-        <w:t xml:space="preserve">Languages &amp; Web: </w:t>
-      </w:r>
-      <w:r>
-        <w:rPr>
-          <w:sz w:val="21"/>
-          <w:szCs w:val="21"/>
-        </w:rPr>
-        <w:t xml:space="preserve">Python, TypeScript/React, JavaScript, SQL, PHP</w:t>
-      </w:r>
-      <w:r>
-        <w:t xml:space="preserve"/>
-      </w:r>
-      <w:r>
-        <w:rPr>
-          <w:b/>
-          <w:bCs/>
-          <w:sz w:val="21"/>
-          <w:szCs w:val="21"/>
-        </w:rPr>
-        <w:t xml:space="preserve">  •  </w:t>
-      </w:r>
-      <w:r>
-        <w:t xml:space="preserve"/>
-      </w:r>
-      <w:r>
-        <w:t xml:space="preserve"/>
-      </w:r>
-      <w:r>
-        <w:rPr>
-          <w:b/>
-          <w:bCs/>
-          <w:sz w:val="21"/>
-          <w:szCs w:val="21"/>
-        </w:rPr>
-        <w:t xml:space="preserve">AI &amp; Machine Learning: </w:t>
-      </w:r>
-      <w:r>
-        <w:rPr>
-          <w:sz w:val="21"/>
-          <w:szCs w:val="21"/>
-        </w:rPr>
-        <w:t xml:space="preserve">Applied AI, agentic AI, LLMs, RAG, vector search, model evaluation</w:t>
-      </w:r>
-      <w:r>
-        <w:t xml:space="preserve"/>
-      </w:r>
-      <w:r>
-        <w:rPr>
-          <w:b/>
-          <w:bCs/>
-          <w:sz w:val="21"/>
-          <w:szCs w:val="21"/>
-        </w:rPr>
-        <w:t xml:space="preserve">  •  </w:t>
-      </w:r>
-      <w:r>
-        <w:t xml:space="preserve"/>
-      </w:r>
-      <w:r>
-        <w:t xml:space="preserve"/>
-      </w:r>
-      <w:r>
-        <w:rPr>
-          <w:b/>
-          <w:bCs/>
-          <w:sz w:val="21"/>
-          <w:szCs w:val="21"/>
-        </w:rPr>
-        <w:t xml:space="preserve">Leadership: </w:t>
-      </w:r>
-      <w:r>
-        <w:rPr>
-          <w:sz w:val="21"/>
-          <w:szCs w:val="21"/>
-        </w:rPr>
-        <w:t xml:space="preserve">Engineering leadership, scaling teams, manager of managers, org design</w:t>
-      </w:r>
-      <w:r>
-        <w:t xml:space="preserve"/>
-      </w:r>
-      <w:r>
-        <w:t xml:space="preserve"/>
+        <w:t>Distributed systems, AWS, GCP, multi-cloud, Kubernetes, PostgreSQL</w:t>
+      </w:r>
+      <w:r>
+        <w:rPr>
+          <w:b/>
+          <w:bCs/>
+          <w:sz w:val="21"/>
+          <w:szCs w:val="21"/>
+        </w:rPr>
+        <w:t xml:space="preserve">  •  Delivery &amp; DevOps: </w:t>
+      </w:r>
+      <w:r>
+        <w:rPr>
+          <w:sz w:val="21"/>
+          <w:szCs w:val="21"/>
+        </w:rPr>
+        <w:t>Agile/Scrumban, CI/CD, DevOps, secure SDLC, SRE, observability</w:t>
+      </w:r>
+      <w:r>
+        <w:rPr>
+          <w:b/>
+          <w:bCs/>
+          <w:sz w:val="21"/>
+          <w:szCs w:val="21"/>
+        </w:rPr>
+        <w:t xml:space="preserve">  •  Languages &amp; Web: </w:t>
+      </w:r>
+      <w:r>
+        <w:rPr>
+          <w:sz w:val="21"/>
+          <w:szCs w:val="21"/>
+        </w:rPr>
+        <w:t>Python, TypeScript/React, JavaScript, SQL, PHP</w:t>
+      </w:r>
+      <w:r>
+        <w:rPr>
+          <w:b/>
+          <w:bCs/>
+          <w:sz w:val="21"/>
+          <w:szCs w:val="21"/>
+        </w:rPr>
+        <w:t xml:space="preserve">  •  AI &amp; Machine Learning: </w:t>
+      </w:r>
+      <w:r>
+        <w:rPr>
+          <w:sz w:val="21"/>
+          <w:szCs w:val="21"/>
+        </w:rPr>
+        <w:t>Applied AI, agentic AI, LLMs, RAG, vector search, model evaluation</w:t>
+      </w:r>
+      <w:r>
+        <w:rPr>
+          <w:b/>
+          <w:bCs/>
+          <w:sz w:val="21"/>
+          <w:szCs w:val="21"/>
+        </w:rPr>
+        <w:t xml:space="preserve">  •  Leadership: </w:t>
+      </w:r>
+      <w:r>
+        <w:rPr>
+          <w:sz w:val="21"/>
+          <w:szCs w:val="21"/>
+        </w:rPr>
+        <w:t>Engineering leadership, scaling teams, manager of managers, org design</w:t>
       </w:r>
     </w:p>
     <w:p>

</xml_diff>